<commit_message>
Atualização de status de leitura
</commit_message>
<xml_diff>
--- a/documentation/manual-translation/ManualTranslation.docx
+++ b/documentation/manual-translation/ManualTranslation.docx
@@ -11,23 +11,24 @@
         <w:rPr>
           <w:b/>
           <w:bCs/>
+          <w:sz w:val="36"/>
+          <w:szCs w:val="36"/>
+          <w:highlight w:val="yellow"/>
+        </w:rPr>
+      </w:pPr>
+      <w:r>
+        <w:rPr>
           <w:sz w:val="28"/>
           <w:szCs w:val="28"/>
-          <w:highlight w:val="none"/>
-        </w:rPr>
-      </w:pPr>
-      <w:r>
-        <w:rPr>
-          <w:sz w:val="28"/>
-          <w:szCs w:val="28"/>
-        </w:rPr>
-        <w:t xml:space="preserve">w</w:t>
+          <w:highlight w:val="yellow"/>
+        </w:rPr>
       </w:r>
       <w:bookmarkStart w:id="0" w:name="_GoBack"/>
       <w:r>
         <w:rPr>
-          <w:sz w:val="28"/>
-          <w:szCs w:val="28"/>
+          <w:sz w:val="36"/>
+          <w:szCs w:val="36"/>
+          <w:highlight w:val="yellow"/>
         </w:rPr>
       </w:r>
       <w:bookmarkEnd w:id="0"/>
@@ -35,8 +36,9 @@
         <w:rPr>
           <w:b/>
           <w:bCs/>
-          <w:sz w:val="28"/>
-          <w:szCs w:val="28"/>
+          <w:sz w:val="36"/>
+          <w:szCs w:val="36"/>
+          <w:highlight w:val="yellow"/>
         </w:rPr>
         <w:t xml:space="preserve">1 – Entendendo os Modelos de Linguagem de Grande Porte</w:t>
       </w:r>
@@ -44,18 +46,18 @@
         <w:rPr>
           <w:b/>
           <w:bCs/>
-          <w:sz w:val="28"/>
-          <w:szCs w:val="28"/>
-          <w:highlight w:val="none"/>
+          <w:sz w:val="36"/>
+          <w:szCs w:val="36"/>
+          <w:highlight w:val="yellow"/>
         </w:rPr>
       </w:r>
       <w:r>
         <w:rPr>
           <w:b/>
           <w:bCs/>
-          <w:sz w:val="28"/>
-          <w:szCs w:val="28"/>
-          <w:highlight w:val="none"/>
+          <w:sz w:val="36"/>
+          <w:szCs w:val="36"/>
+          <w:highlight w:val="yellow"/>
         </w:rPr>
       </w:r>
     </w:p>
@@ -7647,6 +7649,302 @@
         </w:rPr>
       </w:r>
     </w:p>
+    <w:p>
+      <w:pPr>
+        <w:pBdr/>
+        <w:shd w:val="nil"/>
+        <w:spacing/>
+        <w:ind/>
+        <w:rPr>
+          <w:highlight w:val="none"/>
+          <w14:ligatures w14:val="none"/>
+        </w:rPr>
+      </w:pPr>
+      <w:r>
+        <w:rPr>
+          <w:highlight w:val="none"/>
+        </w:rPr>
+        <w:br w:type="page" w:clear="all"/>
+      </w:r>
+      <w:r>
+        <w:rPr>
+          <w:highlight w:val="none"/>
+        </w:rPr>
+      </w:r>
+      <w:r>
+        <w:rPr>
+          <w:highlight w:val="none"/>
+        </w:rPr>
+      </w:r>
+    </w:p>
+    <w:p>
+      <w:pPr>
+        <w:pBdr/>
+        <w:spacing/>
+        <w:ind/>
+        <w:jc w:val="both"/>
+        <w:rPr>
+          <w:b/>
+          <w:bCs/>
+          <w:sz w:val="36"/>
+          <w:szCs w:val="36"/>
+          <w:highlight w:val="none"/>
+          <w:lang w:val="pt-BR"/>
+          <w14:ligatures w14:val="none"/>
+        </w:rPr>
+      </w:pPr>
+      <w:r>
+        <w:rPr>
+          <w:b/>
+          <w:bCs/>
+          <w:sz w:val="36"/>
+          <w:szCs w:val="36"/>
+          <w:highlight w:val="yellow"/>
+        </w:rPr>
+      </w:r>
+      <w:r>
+        <w:rPr>
+          <w:b/>
+          <w:bCs/>
+          <w:sz w:val="36"/>
+          <w:szCs w:val="36"/>
+          <w:highlight w:val="yellow"/>
+          <w:lang w:val="undefined"/>
+        </w:rPr>
+        <w:t xml:space="preserve">2 </w:t>
+      </w:r>
+      <w:r>
+        <w:rPr>
+          <w:b/>
+          <w:bCs/>
+          <w:sz w:val="36"/>
+          <w:szCs w:val="36"/>
+          <w:highlight w:val="yellow"/>
+        </w:rPr>
+        <w:t xml:space="preserve">Trabalhando com dados de texto</w:t>
+      </w:r>
+      <w:r>
+        <w:rPr>
+          <w:b/>
+          <w:bCs/>
+          <w:sz w:val="36"/>
+          <w:szCs w:val="36"/>
+          <w:highlight w:val="yellow"/>
+        </w:rPr>
+      </w:r>
+      <w:r>
+        <w:rPr>
+          <w:b/>
+          <w:bCs/>
+          <w:sz w:val="36"/>
+          <w:szCs w:val="36"/>
+          <w:highlight w:val="yellow"/>
+        </w:rPr>
+      </w:r>
+    </w:p>
+    <w:p>
+      <w:pPr>
+        <w:pBdr/>
+        <w:shd w:val="nil"/>
+        <w:spacing/>
+        <w:ind w:right="0" w:firstLine="0" w:left="0"/>
+        <w:jc w:val="both"/>
+        <w:rPr>
+          <w:highlight w:val="none"/>
+          <w14:ligatures w14:val="none"/>
+        </w:rPr>
+      </w:pPr>
+      <w:r>
+        <w:rPr>
+          <w:highlight w:val="none"/>
+          <w:lang w:val="undefined"/>
+        </w:rPr>
+        <w:t xml:space="preserve">Este capítulo aborda:</w:t>
+      </w:r>
+      <w:r>
+        <w:rPr>
+          <w:highlight w:val="none"/>
+          <w:lang w:val="undefined"/>
+        </w:rPr>
+      </w:r>
+    </w:p>
+    <w:p>
+      <w:pPr>
+        <w:pStyle w:val="904"/>
+        <w:numPr>
+          <w:ilvl w:val="0"/>
+          <w:numId w:val="7"/>
+        </w:numPr>
+        <w:pBdr/>
+        <w:shd w:val="nil"/>
+        <w:spacing/>
+        <w:ind w:right="0"/>
+        <w:jc w:val="both"/>
+        <w:rPr>
+          <w:highlight w:val="none"/>
+          <w14:ligatures w14:val="none"/>
+        </w:rPr>
+      </w:pPr>
+      <w:r>
+        <w:rPr>
+          <w:highlight w:val="none"/>
+          <w:lang w:val="undefined"/>
+        </w:rPr>
+        <w:t xml:space="preserve">Preparação de texto para o treinamento de grandes modelos de linguagem</w:t>
+      </w:r>
+      <w:r>
+        <w:rPr>
+          <w:highlight w:val="none"/>
+        </w:rPr>
+      </w:r>
+    </w:p>
+    <w:p>
+      <w:pPr>
+        <w:pStyle w:val="904"/>
+        <w:numPr>
+          <w:ilvl w:val="0"/>
+          <w:numId w:val="7"/>
+        </w:numPr>
+        <w:pBdr/>
+        <w:shd w:val="nil" w:color="000000"/>
+        <w:spacing/>
+        <w:ind w:right="0"/>
+        <w:jc w:val="both"/>
+        <w:rPr>
+          <w:highlight w:val="none"/>
+          <w14:ligatures w14:val="none"/>
+        </w:rPr>
+      </w:pPr>
+      <w:r>
+        <w:rPr>
+          <w:highlight w:val="none"/>
+        </w:rPr>
+      </w:r>
+      <w:r>
+        <w:rPr>
+          <w:highlight w:val="none"/>
+        </w:rPr>
+      </w:r>
+      <w:r>
+        <w:rPr>
+          <w:highlight w:val="none"/>
+        </w:rPr>
+      </w:r>
+      <w:r>
+        <w:rPr>
+          <w:highlight w:val="none"/>
+        </w:rPr>
+        <w:t xml:space="preserve">Divisão de texto em tokens de palavras e subpalavras</w:t>
+      </w:r>
+      <w:r>
+        <w:rPr>
+          <w:highlight w:val="none"/>
+        </w:rPr>
+      </w:r>
+    </w:p>
+    <w:p>
+      <w:pPr>
+        <w:pStyle w:val="904"/>
+        <w:numPr>
+          <w:ilvl w:val="0"/>
+          <w:numId w:val="7"/>
+        </w:numPr>
+        <w:pBdr/>
+        <w:shd w:val="nil" w:color="000000"/>
+        <w:spacing/>
+        <w:ind w:right="0"/>
+        <w:jc w:val="both"/>
+        <w:rPr>
+          <w:highlight w:val="none"/>
+          <w14:ligatures w14:val="none"/>
+        </w:rPr>
+      </w:pPr>
+      <w:r>
+        <w:rPr>
+          <w:highlight w:val="none"/>
+        </w:rPr>
+      </w:r>
+      <w:r>
+        <w:rPr>
+          <w:highlight w:val="none"/>
+        </w:rPr>
+        <w:t xml:space="preserve">*Byte pair encoding* como uma forma mais avançada de tokenização de texto</w:t>
+      </w:r>
+      <w:r>
+        <w:rPr>
+          <w:highlight w:val="none"/>
+        </w:rPr>
+      </w:r>
+    </w:p>
+    <w:p>
+      <w:pPr>
+        <w:pStyle w:val="904"/>
+        <w:numPr>
+          <w:ilvl w:val="0"/>
+          <w:numId w:val="7"/>
+        </w:numPr>
+        <w:pBdr/>
+        <w:shd w:val="nil" w:color="000000"/>
+        <w:spacing/>
+        <w:ind w:right="0"/>
+        <w:jc w:val="both"/>
+        <w:rPr>
+          <w:highlight w:val="none"/>
+          <w14:ligatures w14:val="none"/>
+        </w:rPr>
+      </w:pPr>
+      <w:r>
+        <w:rPr>
+          <w:highlight w:val="none"/>
+        </w:rPr>
+      </w:r>
+      <w:r>
+        <w:rPr>
+          <w:highlight w:val="none"/>
+        </w:rPr>
+        <w:t xml:space="preserve">Amostragem de exemplos de treinamento com uma abordagem de janela deslizante</w:t>
+      </w:r>
+      <w:r>
+        <w:rPr>
+          <w:highlight w:val="none"/>
+        </w:rPr>
+      </w:r>
+    </w:p>
+    <w:p>
+      <w:pPr>
+        <w:pStyle w:val="904"/>
+        <w:numPr>
+          <w:ilvl w:val="0"/>
+          <w:numId w:val="7"/>
+        </w:numPr>
+        <w:pBdr/>
+        <w:shd w:val="nil" w:color="000000"/>
+        <w:spacing/>
+        <w:ind w:right="0"/>
+        <w:jc w:val="both"/>
+        <w:rPr>
+          <w:highlight w:val="none"/>
+          <w14:ligatures w14:val="none"/>
+        </w:rPr>
+      </w:pPr>
+      <w:r>
+        <w:rPr>
+          <w:highlight w:val="none"/>
+        </w:rPr>
+      </w:r>
+      <w:r>
+        <w:rPr>
+          <w:highlight w:val="none"/>
+        </w:rPr>
+        <w:t xml:space="preserve">Conversão de tokens em vetores para alimentar um grande modelo de linguagem</w:t>
+      </w:r>
+      <w:r>
+        <w:rPr>
+          <w:highlight w:val="none"/>
+        </w:rPr>
+      </w:r>
+      <w:r/>
+    </w:p>
     <w:sectPr>
       <w:headerReference w:type="default" r:id="rId9"/>
       <w:footnotePr/>
@@ -8590,6 +8888,135 @@
       <w:suff w:val="tab"/>
     </w:lvl>
   </w:abstractNum>
+  <w:abstractNum w:abstractNumId="6">
+    <w:nsid w:val="036C26C3"/>
+    <w:lvl w:ilvl="0">
+      <w:isLgl w:val="false"/>
+      <w:lvlJc w:val="left"/>
+      <w:lvlText w:val="%1."/>
+      <w:numFmt w:val="decimal"/>
+      <w:pPr>
+        <w:pBdr/>
+        <w:spacing/>
+        <w:ind w:hanging="360" w:left="709"/>
+      </w:pPr>
+      <w:rPr/>
+      <w:start w:val="1"/>
+      <w:suff w:val="tab"/>
+    </w:lvl>
+    <w:lvl w:ilvl="1">
+      <w:isLgl w:val="false"/>
+      <w:lvlJc w:val="left"/>
+      <w:lvlText w:val="%2."/>
+      <w:numFmt w:val="lowerLetter"/>
+      <w:pPr>
+        <w:pBdr/>
+        <w:spacing/>
+        <w:ind w:hanging="360" w:left="1429"/>
+      </w:pPr>
+      <w:rPr/>
+      <w:start w:val="1"/>
+      <w:suff w:val="tab"/>
+    </w:lvl>
+    <w:lvl w:ilvl="2">
+      <w:isLgl w:val="false"/>
+      <w:lvlJc w:val="right"/>
+      <w:lvlText w:val="%3."/>
+      <w:numFmt w:val="lowerRoman"/>
+      <w:pPr>
+        <w:pBdr/>
+        <w:spacing/>
+        <w:ind w:hanging="180" w:left="2149"/>
+      </w:pPr>
+      <w:rPr/>
+      <w:start w:val="1"/>
+      <w:suff w:val="tab"/>
+    </w:lvl>
+    <w:lvl w:ilvl="3">
+      <w:isLgl w:val="false"/>
+      <w:lvlJc w:val="left"/>
+      <w:lvlText w:val="%4."/>
+      <w:numFmt w:val="decimal"/>
+      <w:pPr>
+        <w:pBdr/>
+        <w:spacing/>
+        <w:ind w:hanging="360" w:left="2869"/>
+      </w:pPr>
+      <w:rPr/>
+      <w:start w:val="1"/>
+      <w:suff w:val="tab"/>
+    </w:lvl>
+    <w:lvl w:ilvl="4">
+      <w:isLgl w:val="false"/>
+      <w:lvlJc w:val="left"/>
+      <w:lvlText w:val="%5."/>
+      <w:numFmt w:val="lowerLetter"/>
+      <w:pPr>
+        <w:pBdr/>
+        <w:spacing/>
+        <w:ind w:hanging="360" w:left="3589"/>
+      </w:pPr>
+      <w:rPr/>
+      <w:start w:val="1"/>
+      <w:suff w:val="tab"/>
+    </w:lvl>
+    <w:lvl w:ilvl="5">
+      <w:isLgl w:val="false"/>
+      <w:lvlJc w:val="right"/>
+      <w:lvlText w:val="%6."/>
+      <w:numFmt w:val="lowerRoman"/>
+      <w:pPr>
+        <w:pBdr/>
+        <w:spacing/>
+        <w:ind w:hanging="180" w:left="4309"/>
+      </w:pPr>
+      <w:rPr/>
+      <w:start w:val="1"/>
+      <w:suff w:val="tab"/>
+    </w:lvl>
+    <w:lvl w:ilvl="6">
+      <w:isLgl w:val="false"/>
+      <w:lvlJc w:val="left"/>
+      <w:lvlText w:val="%7."/>
+      <w:numFmt w:val="decimal"/>
+      <w:pPr>
+        <w:pBdr/>
+        <w:spacing/>
+        <w:ind w:hanging="360" w:left="5029"/>
+      </w:pPr>
+      <w:rPr/>
+      <w:start w:val="1"/>
+      <w:suff w:val="tab"/>
+    </w:lvl>
+    <w:lvl w:ilvl="7">
+      <w:isLgl w:val="false"/>
+      <w:lvlJc w:val="left"/>
+      <w:lvlText w:val="%8."/>
+      <w:numFmt w:val="lowerLetter"/>
+      <w:pPr>
+        <w:pBdr/>
+        <w:spacing/>
+        <w:ind w:hanging="360" w:left="5749"/>
+      </w:pPr>
+      <w:rPr/>
+      <w:start w:val="1"/>
+      <w:suff w:val="tab"/>
+    </w:lvl>
+    <w:lvl w:ilvl="8">
+      <w:isLgl w:val="false"/>
+      <w:lvlJc w:val="right"/>
+      <w:lvlText w:val="%9."/>
+      <w:numFmt w:val="lowerRoman"/>
+      <w:pPr>
+        <w:pBdr/>
+        <w:spacing/>
+        <w:ind w:hanging="180" w:left="6469"/>
+      </w:pPr>
+      <w:rPr/>
+      <w:start w:val="1"/>
+      <w:suff w:val="tab"/>
+    </w:lvl>
+  </w:abstractNum>
   <w:num w:numId="1">
     <w:abstractNumId w:val="0"/>
   </w:num>
@@ -8607,6 +9034,9 @@
   </w:num>
   <w:num w:numId="6">
     <w:abstractNumId w:val="5"/>
+  </w:num>
+  <w:num w:numId="7">
+    <w:abstractNumId w:val="6"/>
   </w:num>
 </w:numbering>
 </file>

</xml_diff>